<commit_message>
chore: 清理冗余文件、添加 .gitignore 并停止跟踪 users_api.json
</commit_message>
<xml_diff>
--- a/resource/模板文件/文书模板/工伤案件审批表（模板）.docx
+++ b/resource/模板文件/文书模板/工伤案件审批表（模板）.docx
@@ -570,34 +570,31 @@
                 <w:sz w:val="24"/>
                 <w:szCs w:val="24"/>
               </w:rPr>
-              <w:t>{</w:t>
-            </w:r>
-            <w:r>
-              <w:rPr>
-                <w:rFonts w:ascii="宋体" w:cs="宋体"/>
-                <w:kern w:val="0"/>
-                <w:sz w:val="24"/>
-                <w:szCs w:val="24"/>
-              </w:rPr>
-              <w:t>{</w:t>
-            </w:r>
-            <w:r>
-              <w:rPr>
-                <w:rFonts w:ascii="宋体" w:cs="宋体" w:hint="eastAsia"/>
-                <w:kern w:val="0"/>
-                <w:sz w:val="24"/>
-                <w:szCs w:val="24"/>
-              </w:rPr>
-              <w:t>公司名称</w:t>
-            </w:r>
-            <w:r>
-              <w:rPr>
-                <w:rFonts w:ascii="宋体" w:cs="宋体"/>
-                <w:kern w:val="0"/>
-                <w:sz w:val="24"/>
-                <w:szCs w:val="24"/>
-              </w:rPr>
-              <w:t>}}</w:t>
+              <w:t>{{用人单位}}</w:t>
+            </w:r>
+            <w:r>
+              <w:rPr>
+                <w:rFonts w:ascii="宋体" w:cs="宋体"/>
+                <w:kern w:val="0"/>
+                <w:sz w:val="24"/>
+                <w:szCs w:val="24"/>
+              </w:rPr>
+            </w:r>
+            <w:r>
+              <w:rPr>
+                <w:rFonts w:ascii="宋体" w:cs="宋体" w:hint="eastAsia"/>
+                <w:kern w:val="0"/>
+                <w:sz w:val="24"/>
+                <w:szCs w:val="24"/>
+              </w:rPr>
+            </w:r>
+            <w:r>
+              <w:rPr>
+                <w:rFonts w:ascii="宋体" w:cs="宋体"/>
+                <w:kern w:val="0"/>
+                <w:sz w:val="24"/>
+                <w:szCs w:val="24"/>
+              </w:rPr>
             </w:r>
           </w:p>
         </w:tc>

</xml_diff>